<commit_message>
task 3 y 4
Daniel hizo el 3 pero en collab, yo solo subo el ipynb en github
</commit_message>
<xml_diff>
--- a/LAB7.docx
+++ b/LAB7.docx
@@ -5,13 +5,18 @@
     <w:p>
       <w:pPr>
         <w:jc w:val="center"/>
-      </w:pPr>
-      <w:r>
         <w:rPr>
           <w:b/>
           <w:bCs/>
           <w:u w:val="single"/>
         </w:rPr>
+      </w:pPr>
+      <w:r>
+        <w:rPr>
+          <w:b/>
+          <w:bCs/>
+          <w:u w:val="single"/>
+        </w:rPr>
         <w:t>Laboratorio 7</w:t>
       </w:r>
     </w:p>
@@ -23,6 +28,54 @@
           <w:bCs/>
         </w:rPr>
       </w:pPr>
+      <w:r>
+        <w:rPr>
+          <w:b/>
+          <w:bCs/>
+        </w:rPr>
+        <w:t xml:space="preserve">Repositorio de </w:t>
+      </w:r>
+      <w:proofErr w:type="spellStart"/>
+      <w:r>
+        <w:rPr>
+          <w:b/>
+          <w:bCs/>
+        </w:rPr>
+        <w:t>github</w:t>
+      </w:r>
+      <w:proofErr w:type="spellEnd"/>
+      <w:r>
+        <w:rPr>
+          <w:b/>
+          <w:bCs/>
+        </w:rPr>
+        <w:t>:</w:t>
+      </w:r>
+    </w:p>
+    <w:p>
+      <w:pPr>
+        <w:jc w:val="both"/>
+      </w:pPr>
+      <w:hyperlink r:id="rId7" w:history="1">
+        <w:r>
+          <w:rPr>
+            <w:rStyle w:val="Hipervnculo"/>
+          </w:rPr>
+          <w:t>https://github.com/ArielaMishaanCohen/LAB7.git</w:t>
+        </w:r>
+      </w:hyperlink>
+      <w:r>
+        <w:t xml:space="preserve"> </w:t>
+      </w:r>
+    </w:p>
+    <w:p>
+      <w:pPr>
+        <w:jc w:val="both"/>
+        <w:rPr>
+          <w:b/>
+          <w:bCs/>
+        </w:rPr>
+      </w:pPr>
       <w:proofErr w:type="spellStart"/>
       <w:r>
         <w:rPr>
@@ -75,13 +128,7 @@
       </w:r>
       <w:proofErr w:type="spellEnd"/>
       <w:r>
-        <w:t xml:space="preserve"> como parte de la solución. Sin</w:t>
-      </w:r>
-      <w:r>
-        <w:t xml:space="preserve"> </w:t>
-      </w:r>
-      <w:r>
-        <w:t>embargo, el médico le pregunta: "¿No estamos inventando datos falsos que podrían confundir al modelo?</w:t>
+        <w:t xml:space="preserve"> como parte de la solución. Sin embargo, el médico le pregunta: "¿No estamos inventando datos falsos que podrían confundir al modelo?</w:t>
       </w:r>
     </w:p>
     <w:p>
@@ -165,14 +212,7 @@
           <w:b/>
           <w:bCs/>
         </w:rPr>
-        <w:t>En el contexto específico de radiografías de tórax, proponga tres transformaciones de Data</w:t>
-      </w:r>
-      <w:r>
-        <w:rPr>
-          <w:b/>
-          <w:bCs/>
-        </w:rPr>
-        <w:t xml:space="preserve"> </w:t>
+        <w:t xml:space="preserve">En el contexto específico de radiografías de tórax, proponga tres transformaciones de Data </w:t>
       </w:r>
       <w:proofErr w:type="spellStart"/>
       <w:r>
@@ -188,35 +228,7 @@
           <w:b/>
           <w:bCs/>
         </w:rPr>
-        <w:t xml:space="preserve"> que serían válidas y justifique cada una. Luego, identifique una transformación que</w:t>
-      </w:r>
-      <w:r>
-        <w:rPr>
-          <w:b/>
-          <w:bCs/>
-        </w:rPr>
-        <w:t xml:space="preserve"> </w:t>
-      </w:r>
-      <w:r>
-        <w:rPr>
-          <w:b/>
-          <w:bCs/>
-        </w:rPr>
-        <w:t>no debería aplicarse en este dominio médico y explique por qué podría comprometer la integridad</w:t>
-      </w:r>
-      <w:r>
-        <w:rPr>
-          <w:b/>
-          <w:bCs/>
-        </w:rPr>
-        <w:t xml:space="preserve"> </w:t>
-      </w:r>
-      <w:r>
-        <w:rPr>
-          <w:b/>
-          <w:bCs/>
-        </w:rPr>
-        <w:t>diagnóstica del modelo.</w:t>
+        <w:t xml:space="preserve"> que serían válidas y justifique cada una. Luego, identifique una transformación que no debería aplicarse en este dominio médico y explique por qué podría comprometer la integridad diagnóstica del modelo.</w:t>
       </w:r>
     </w:p>
     <w:p>
@@ -238,12 +250,10 @@
         <w:t xml:space="preserve"> un paciente puede que no esté perfectamente centrado en el equipo de rayos x. Una rotación pequeña replica esa variabilidad sin desplazar anatomía crítica fuera del </w:t>
       </w:r>
       <w:proofErr w:type="spellStart"/>
-      <w:proofErr w:type="gramStart"/>
       <w:r>
         <w:t>frame</w:t>
       </w:r>
       <w:proofErr w:type="spellEnd"/>
-      <w:proofErr w:type="gramEnd"/>
       <w:r>
         <w:t xml:space="preserve">. </w:t>
       </w:r>
@@ -322,24 +332,14 @@
         <w:rPr>
           <w:u w:val="single"/>
         </w:rPr>
-        <w:t xml:space="preserve">Transformación inválida – </w:t>
-      </w:r>
-      <w:proofErr w:type="gramStart"/>
-      <w:r>
-        <w:rPr>
-          <w:u w:val="single"/>
-        </w:rPr>
-        <w:t>Zoom</w:t>
-      </w:r>
-      <w:proofErr w:type="gramEnd"/>
-      <w:r>
-        <w:rPr>
-          <w:u w:val="single"/>
-        </w:rPr>
-        <w:t>/Crop agresivo:</w:t>
-      </w:r>
-      <w:r>
-        <w:t xml:space="preserve"> Recortar fuertemente la imagen puede eliminar regiones del pulmón que son diagnósticamente relevantes. Un modelo entrenado con imágenes recortadas podría ignorar zonas donde la neumonía se manifiesta frecuentemente, comprometiendo su sensibilidad clínica. </w:t>
+        <w:t>Transformación inválida – Zoom/Crop agresivo:</w:t>
+      </w:r>
+      <w:r>
+        <w:t xml:space="preserve"> Recortar fuertemente la imagen puede eliminar regiones del pulmón que son diagnósticamente relevantes. Un </w:t>
+      </w:r>
+      <w:r>
+        <w:lastRenderedPageBreak/>
+        <w:t xml:space="preserve">modelo entrenado con imágenes recortadas podría ignorar zonas donde la neumonía se manifiesta frecuentemente, comprometiendo su sensibilidad clínica. </w:t>
       </w:r>
     </w:p>
     <w:p>
@@ -360,15 +360,7 @@
           <w:b/>
           <w:bCs/>
         </w:rPr>
-        <w:lastRenderedPageBreak/>
-        <w:t>¿</w:t>
-      </w:r>
-      <w:r>
-        <w:rPr>
-          <w:b/>
-          <w:bCs/>
-        </w:rPr>
-        <w:t xml:space="preserve">Es el Data </w:t>
+        <w:t xml:space="preserve">¿Es el Data </w:t>
       </w:r>
       <w:proofErr w:type="spellStart"/>
       <w:r>
@@ -384,30 +376,64 @@
           <w:b/>
           <w:bCs/>
         </w:rPr>
-        <w:t xml:space="preserve"> suficiente por sí solo para garantizar que el modelo generalice bien?</w:t>
-      </w:r>
-      <w:r>
-        <w:rPr>
-          <w:b/>
-          <w:bCs/>
-        </w:rPr>
+        <w:t xml:space="preserve"> suficiente por sí solo para garantizar que el modelo generalice bien? Argumente su posición considerando otras variables del proceso de entrenamiento.</w:t>
+      </w:r>
+    </w:p>
+    <w:p>
+      <w:pPr>
+        <w:pStyle w:val="Prrafodelista"/>
+        <w:jc w:val="both"/>
+      </w:pPr>
+      <w:r>
+        <w:t xml:space="preserve">No. El data </w:t>
+      </w:r>
+      <w:proofErr w:type="spellStart"/>
+      <w:r>
+        <w:t>augmentation</w:t>
+      </w:r>
+      <w:proofErr w:type="spellEnd"/>
+      <w:r>
+        <w:t xml:space="preserve"> agranda la variabilidad aparente del set de entrenamiento, pero no reemplaza datos reales diversos. Hay otras variables críticas: la arquitectura del modelo (debe tener la capacidad </w:t>
+      </w:r>
+      <w:proofErr w:type="spellStart"/>
+      <w:r>
+        <w:t>adecueda</w:t>
+      </w:r>
+      <w:proofErr w:type="spellEnd"/>
+      <w:r>
+        <w:t>, ni demasiado compleja ni demasiado simple), la regularización (</w:t>
+      </w:r>
+      <w:proofErr w:type="spellStart"/>
+      <w:r>
+        <w:t>dropout</w:t>
+      </w:r>
+      <w:proofErr w:type="spellEnd"/>
+      <w:r>
+        <w:t xml:space="preserve">, </w:t>
+      </w:r>
+      <w:proofErr w:type="spellStart"/>
+      <w:r>
+        <w:t>weight</w:t>
+      </w:r>
+      <w:proofErr w:type="spellEnd"/>
+      <w:r>
         <w:t xml:space="preserve"> </w:t>
       </w:r>
-      <w:r>
-        <w:rPr>
-          <w:b/>
-          <w:bCs/>
-        </w:rPr>
-        <w:t>Argumente su posición considerando otras variables del proceso de entrenamiento.</w:t>
-      </w:r>
-    </w:p>
-    <w:p>
-      <w:pPr>
-        <w:pStyle w:val="Prrafodelista"/>
-        <w:jc w:val="both"/>
-      </w:pPr>
-      <w:r>
-        <w:t xml:space="preserve">No. El data </w:t>
+      <w:proofErr w:type="spellStart"/>
+      <w:r>
+        <w:t>decay</w:t>
+      </w:r>
+      <w:proofErr w:type="spellEnd"/>
+      <w:r>
+        <w:t xml:space="preserve">) para penalizar la memorización, la función de pérdida (en clases desbalanceadas, </w:t>
+      </w:r>
+      <w:proofErr w:type="spellStart"/>
+      <w:r>
+        <w:t>cross-entropy</w:t>
+      </w:r>
+      <w:proofErr w:type="spellEnd"/>
+      <w:r>
+        <w:t xml:space="preserve"> simple puede ser insuficiente), y la calidad del etiquetado (800 imágenes con etiquetas inconsistentes son peores que 500 bien etiquetadas). El </w:t>
       </w:r>
       <w:proofErr w:type="spellStart"/>
       <w:r>
@@ -415,63 +441,13 @@
       </w:r>
       <w:proofErr w:type="spellEnd"/>
       <w:r>
-        <w:t xml:space="preserve"> agranda la variabilidad aparente del set de entrenamiento, pero no reemplaza datos reales diversos. Hay otras variables críticas: la arquitectura del modelo (debe tener la capacidad </w:t>
-      </w:r>
-      <w:proofErr w:type="spellStart"/>
-      <w:r>
-        <w:t>adecueda</w:t>
-      </w:r>
-      <w:proofErr w:type="spellEnd"/>
-      <w:r>
-        <w:t>, ni demasiado compleja ni demasiado simple), la regularización (</w:t>
-      </w:r>
-      <w:proofErr w:type="spellStart"/>
-      <w:r>
-        <w:t>dropout</w:t>
-      </w:r>
-      <w:proofErr w:type="spellEnd"/>
-      <w:r>
-        <w:t xml:space="preserve">, </w:t>
-      </w:r>
-      <w:proofErr w:type="spellStart"/>
-      <w:r>
-        <w:t>weight</w:t>
-      </w:r>
-      <w:proofErr w:type="spellEnd"/>
-      <w:r>
-        <w:t xml:space="preserve"> </w:t>
-      </w:r>
-      <w:proofErr w:type="spellStart"/>
-      <w:r>
-        <w:t>decay</w:t>
-      </w:r>
-      <w:proofErr w:type="spellEnd"/>
-      <w:r>
-        <w:t xml:space="preserve">) para penalizar la memorización, la función de pérdida (en clases desbalanceadas, </w:t>
-      </w:r>
-      <w:proofErr w:type="spellStart"/>
-      <w:r>
-        <w:t>cross-entropy</w:t>
-      </w:r>
-      <w:proofErr w:type="spellEnd"/>
-      <w:r>
-        <w:t xml:space="preserve"> simple puede ser insuficiente), y la calidad del etiquetado (800 imágenes con etiquetas inconsistentes son peores que 500 bien etiquetadas). El </w:t>
-      </w:r>
-      <w:proofErr w:type="spellStart"/>
-      <w:r>
-        <w:t>augmentation</w:t>
-      </w:r>
-      <w:proofErr w:type="spellEnd"/>
-      <w:r>
         <w:t xml:space="preserve"> reduce el </w:t>
       </w:r>
       <w:proofErr w:type="spellStart"/>
-      <w:proofErr w:type="gramStart"/>
       <w:r>
         <w:t>overfitting</w:t>
       </w:r>
       <w:proofErr w:type="spellEnd"/>
-      <w:proofErr w:type="gramEnd"/>
       <w:r>
         <w:t xml:space="preserve"> pero no lo elimina si el modelo es excesivamente profundo para el volumen de datos disponible. </w:t>
       </w:r>
@@ -503,13 +479,7 @@
       </w:r>
       <w:proofErr w:type="spellEnd"/>
       <w:r>
-        <w:t xml:space="preserve"> Guatemala, el equipo registra las siguientes curvas de</w:t>
-      </w:r>
-      <w:r>
-        <w:t xml:space="preserve"> </w:t>
-      </w:r>
-      <w:r>
-        <w:t>pérdida (</w:t>
+        <w:t xml:space="preserve"> Guatemala, el equipo registra las siguientes curvas de pérdida (</w:t>
       </w:r>
       <w:proofErr w:type="spellStart"/>
       <w:r>
@@ -517,10 +487,7 @@
       </w:r>
       <w:proofErr w:type="spellEnd"/>
       <w:r>
-        <w:t>) al finalizar 25 épocas</w:t>
-      </w:r>
-      <w:r>
-        <w:t>.</w:t>
+        <w:t>) al finalizar 25 épocas.</w:t>
       </w:r>
     </w:p>
     <w:p>
@@ -557,21 +524,7 @@
           <w:b/>
           <w:bCs/>
         </w:rPr>
-        <w:t>) y describa cómo</w:t>
-      </w:r>
-      <w:r>
-        <w:rPr>
-          <w:b/>
-          <w:bCs/>
-        </w:rPr>
-        <w:t xml:space="preserve"> </w:t>
-      </w:r>
-      <w:r>
-        <w:rPr>
-          <w:b/>
-          <w:bCs/>
-        </w:rPr>
-        <w:t>se evidencia en los números de la tabla.</w:t>
+        <w:t>) y describa cómo se evidencia en los números de la tabla.</w:t>
       </w:r>
     </w:p>
     <w:p>
@@ -671,21 +624,7 @@
           <w:b/>
           <w:bCs/>
         </w:rPr>
-        <w:t xml:space="preserve"> o L2) que podría haber</w:t>
-      </w:r>
-      <w:r>
-        <w:rPr>
-          <w:b/>
-          <w:bCs/>
-        </w:rPr>
-        <w:t xml:space="preserve"> </w:t>
-      </w:r>
-      <w:r>
-        <w:rPr>
-          <w:b/>
-          <w:bCs/>
-        </w:rPr>
-        <w:t>implementado para prevenir este comportamiento. Para cada una, explique intuitivamente qué</w:t>
+        <w:t xml:space="preserve"> o L2) que podría haber implementado para prevenir este comportamiento. Para cada una, explique intuitivamente qué</w:t>
       </w:r>
       <w:r>
         <w:rPr>
@@ -839,21 +778,7 @@
           <w:b/>
           <w:bCs/>
         </w:rPr>
-        <w:t>modelo que exhibe este patrón de sobreajuste para el diagnóstico de radiografías? Argumente más</w:t>
-      </w:r>
-      <w:r>
-        <w:rPr>
-          <w:b/>
-          <w:bCs/>
-        </w:rPr>
-        <w:t xml:space="preserve"> </w:t>
-      </w:r>
-      <w:r>
-        <w:rPr>
-          <w:b/>
-          <w:bCs/>
-        </w:rPr>
-        <w:t>allá de los números</w:t>
+        <w:t>modelo que exhibe este patrón de sobreajuste para el diagnóstico de radiografías? Argumente más allá de los números</w:t>
       </w:r>
     </w:p>
     <w:p>
@@ -918,10 +843,7 @@
         <w:jc w:val="both"/>
       </w:pPr>
       <w:r>
-        <w:t>Un inversionista que asiste a la demo del proyecto le pregunta: "¿Por qué su modelo tiene un 94% de</w:t>
-      </w:r>
-      <w:r>
-        <w:t xml:space="preserve"> </w:t>
+        <w:t xml:space="preserve">Un inversionista que asiste a la demo del proyecto le pregunta: "¿Por qué su modelo tiene un 94% de </w:t>
       </w:r>
       <w:proofErr w:type="spellStart"/>
       <w:r>
@@ -940,16 +862,7 @@
         <w:jc w:val="both"/>
       </w:pPr>
       <w:r>
-        <w:t>Usted sabe que el dataset de prueba contiene 700 radiografías normales y solo 150 radiografías con</w:t>
-      </w:r>
-      <w:r>
-        <w:t xml:space="preserve"> </w:t>
-      </w:r>
-      <w:r>
-        <w:t>neumonía</w:t>
-      </w:r>
-      <w:r>
-        <w:t>.</w:t>
+        <w:t>Usted sabe que el dataset de prueba contiene 700 radiografías normales y solo 150 radiografías con neumonía.</w:t>
       </w:r>
     </w:p>
     <w:p>
@@ -1002,35 +915,16 @@
           <w:b/>
           <w:bCs/>
         </w:rPr>
-        <w:t xml:space="preserve"> que simplemente predice siempre 'Normal' para</w:t>
-      </w:r>
-      <w:r>
-        <w:rPr>
-          <w:b/>
-          <w:bCs/>
-        </w:rPr>
-        <w:t xml:space="preserve"> </w:t>
-      </w:r>
-      <w:r>
-        <w:rPr>
-          <w:b/>
-          <w:bCs/>
-        </w:rPr>
-        <w:t>todas las imágenes. ¿Qué revela ese cálculo sobre el 94% reportado?</w:t>
-      </w:r>
-    </w:p>
-    <w:p>
-      <w:pPr>
-        <w:pStyle w:val="Prrafodelista"/>
-        <w:jc w:val="both"/>
-      </w:pPr>
-      <w:proofErr w:type="gramStart"/>
-      <w:r>
-        <w:t>Total</w:t>
-      </w:r>
-      <w:proofErr w:type="gramEnd"/>
-      <w:r>
-        <w:t xml:space="preserve"> de imágenes: </w:t>
+        <w:t xml:space="preserve"> que simplemente predice siempre 'Normal' para todas las imágenes. ¿Qué revela ese cálculo sobre el 94% reportado?</w:t>
+      </w:r>
+    </w:p>
+    <w:p>
+      <w:pPr>
+        <w:pStyle w:val="Prrafodelista"/>
+        <w:jc w:val="both"/>
+      </w:pPr>
+      <w:r>
+        <w:t xml:space="preserve">Total de imágenes: </w:t>
       </w:r>
     </w:p>
     <w:p>
@@ -1157,21 +1051,7 @@
           <w:b/>
           <w:bCs/>
         </w:rPr>
-        <w:t>Explique por qué, en problemas médicos con clases desbalanceadas, métricas como el F1-Score o</w:t>
-      </w:r>
-      <w:r>
-        <w:rPr>
-          <w:b/>
-          <w:bCs/>
-        </w:rPr>
-        <w:t xml:space="preserve"> </w:t>
-      </w:r>
-      <w:r>
-        <w:rPr>
-          <w:b/>
-          <w:bCs/>
-        </w:rPr>
-        <w:t>la Sensibilidad (</w:t>
+        <w:t>Explique por qué, en problemas médicos con clases desbalanceadas, métricas como el F1-Score o la Sensibilidad (</w:t>
       </w:r>
       <w:proofErr w:type="spellStart"/>
       <w:r>
@@ -1203,28 +1083,7 @@
           <w:b/>
           <w:bCs/>
         </w:rPr>
-        <w:t>. No se limite</w:t>
-      </w:r>
-      <w:r>
-        <w:rPr>
-          <w:b/>
-          <w:bCs/>
-        </w:rPr>
-        <w:t xml:space="preserve"> </w:t>
-      </w:r>
-      <w:r>
-        <w:rPr>
-          <w:b/>
-          <w:bCs/>
-        </w:rPr>
-        <w:t>a definirlas; argumente su relevancia clínica</w:t>
-      </w:r>
-      <w:r>
-        <w:rPr>
-          <w:b/>
-          <w:bCs/>
-        </w:rPr>
-        <w:t>.</w:t>
+        <w:t>. No se limite a definirlas; argumente su relevancia clínica.</w:t>
       </w:r>
     </w:p>
     <w:p>
@@ -1260,15 +1119,7 @@
       </w:r>
       <w:proofErr w:type="spellEnd"/>
       <w:r>
-        <w:t xml:space="preserve"> bajo significa pacientes enfermos sin diagnóstico, </w:t>
-      </w:r>
-      <w:proofErr w:type="gramStart"/>
-      <w:r>
-        <w:t>el</w:t>
-      </w:r>
-      <w:proofErr w:type="gramEnd"/>
-      <w:r>
-        <w:t xml:space="preserve"> pero resultado clínico posible. El </w:t>
+        <w:t xml:space="preserve"> bajo significa pacientes enfermos sin diagnóstico, el pero resultado clínico posible. El </w:t>
       </w:r>
       <w:proofErr w:type="spellStart"/>
       <w:r>
@@ -1277,15 +1128,7 @@
       </w:r>
       <w:proofErr w:type="spellEnd"/>
       <w:r>
-        <w:t xml:space="preserve"> no distingue entre este error y un falso positivo, </w:t>
-      </w:r>
-      <w:proofErr w:type="gramStart"/>
-      <w:r>
-        <w:t>que</w:t>
-      </w:r>
-      <w:proofErr w:type="gramEnd"/>
-      <w:r>
-        <w:t xml:space="preserve"> aunque sea indeseable, tiene consecuencias menos graves: un examen adicional, no una neumonía sin tratar. </w:t>
+        <w:t xml:space="preserve"> no distingue entre este error y un falso positivo, que aunque sea indeseable, tiene consecuencias menos graves: un examen adicional, no una neumonía sin tratar. </w:t>
       </w:r>
     </w:p>
     <w:p>
@@ -1361,35 +1204,7 @@
           <w:b/>
           <w:bCs/>
         </w:rPr>
-        <w:t>Como director técnico, ¿cómo le respondería al inversionista de forma honesta y profesional?</w:t>
-      </w:r>
-      <w:r>
-        <w:rPr>
-          <w:b/>
-          <w:bCs/>
-        </w:rPr>
-        <w:t xml:space="preserve"> </w:t>
-      </w:r>
-      <w:r>
-        <w:rPr>
-          <w:b/>
-          <w:bCs/>
-        </w:rPr>
-        <w:t>Redacte una respuesta breve (3 a 5 oraciones) que sea técnicamente sólida pero comprensible para</w:t>
-      </w:r>
-      <w:r>
-        <w:rPr>
-          <w:b/>
-          <w:bCs/>
-        </w:rPr>
-        <w:t xml:space="preserve"> </w:t>
-      </w:r>
-      <w:r>
-        <w:rPr>
-          <w:b/>
-          <w:bCs/>
-        </w:rPr>
-        <w:t>un no-especialista.</w:t>
+        <w:t>Como director técnico, ¿cómo le respondería al inversionista de forma honesta y profesional? Redacte una respuesta breve (3 a 5 oraciones) que sea técnicamente sólida pero comprensible para un no-especialista.</w:t>
       </w:r>
     </w:p>
     <w:p>
@@ -1505,15 +1320,7 @@
       </w:r>
       <w:proofErr w:type="spellEnd"/>
       <w:r>
-        <w:t xml:space="preserve"> sí tiene imágenes muy distintas, las primeras capas de una CNN no aprenden objetos específicos, sino patrones básicos visuales como bordes, texturas, gradientes de intensidad y formas simples. Estos patrones también se pueden ver en las radiografías médicas (por </w:t>
-      </w:r>
-      <w:proofErr w:type="gramStart"/>
-      <w:r>
-        <w:t>ejemplo</w:t>
-      </w:r>
-      <w:proofErr w:type="gramEnd"/>
-      <w:r>
-        <w:t xml:space="preserve"> un borde puede representar la orilla de un pulmón, o una textura podría mostrar la condición del tejido). Dado que las capas tempranas aprenden estas características universales, el conocimiento de </w:t>
+        <w:t xml:space="preserve"> sí tiene imágenes muy distintas, las primeras capas de una CNN no aprenden objetos específicos, sino patrones básicos visuales como bordes, texturas, gradientes de intensidad y formas simples. Estos patrones también se pueden ver en las radiografías médicas (por ejemplo un borde puede representar la orilla de un pulmón, o una textura podría mostrar la condición del tejido). Dado que las capas tempranas aprenden estas características universales, el conocimiento de </w:t>
       </w:r>
       <w:proofErr w:type="spellStart"/>
       <w:r>
@@ -1544,23 +1351,7 @@
           <w:b/>
           <w:bCs/>
         </w:rPr>
-        <w:t xml:space="preserve">Más allá del argumento técnico, ¿cuál es el costo real de entrenar desde cero para </w:t>
-      </w:r>
-      <w:proofErr w:type="gramStart"/>
-      <w:r>
-        <w:rPr>
-          <w:b/>
-          <w:bCs/>
-        </w:rPr>
-        <w:t>un startup</w:t>
-      </w:r>
-      <w:proofErr w:type="gramEnd"/>
-      <w:r>
-        <w:rPr>
-          <w:b/>
-          <w:bCs/>
-        </w:rPr>
-        <w:t xml:space="preserve"> como </w:t>
+        <w:t xml:space="preserve">Más allá del argumento técnico, ¿cuál es el costo real de entrenar desde cero para un startup como </w:t>
       </w:r>
       <w:proofErr w:type="spellStart"/>
       <w:r>
@@ -1668,15 +1459,7 @@
         <w:jc w:val="both"/>
       </w:pPr>
       <w:r>
-        <w:t xml:space="preserve">Por ejemplo, si se tuviera un dataset muy grande y específico del dominio médico (por </w:t>
-      </w:r>
-      <w:proofErr w:type="gramStart"/>
-      <w:r>
-        <w:t>ejemplo</w:t>
-      </w:r>
-      <w:proofErr w:type="gramEnd"/>
-      <w:r>
-        <w:t xml:space="preserve"> decenas de miles de radiografías), podría valer la pena entrenar desde cero. Otro caso es en el que el dominio sea muy diferente estructuralmente (imágenes demasiado distintas como </w:t>
+        <w:t xml:space="preserve">Por ejemplo, si se tuviera un dataset muy grande y específico del dominio médico (por ejemplo decenas de miles de radiografías), podría valer la pena entrenar desde cero. Otro caso es en el que el dominio sea muy diferente estructuralmente (imágenes demasiado distintas como </w:t>
       </w:r>
       <w:proofErr w:type="spellStart"/>
       <w:r>
@@ -1804,15 +1587,7 @@
       </w:r>
       <w:proofErr w:type="spellEnd"/>
       <w:r>
-        <w:t xml:space="preserve"> del entrenamiento </w:t>
-      </w:r>
-      <w:proofErr w:type="gramStart"/>
-      <w:r>
-        <w:t>serían  inestables</w:t>
-      </w:r>
-      <w:proofErr w:type="gramEnd"/>
-      <w:r>
-        <w:t>.  </w:t>
+        <w:t xml:space="preserve"> del entrenamiento serían  inestables.  </w:t>
       </w:r>
     </w:p>
     <w:p>
@@ -1928,7 +1703,6 @@
         <w:t xml:space="preserve">Evaluar la viabilidad de reutilizar el modelo de neumonía para el nuevo problema de fracturas en </w:t>
       </w:r>
       <w:proofErr w:type="spellStart"/>
-      <w:proofErr w:type="gramStart"/>
       <w:r>
         <w:rPr>
           <w:b/>
@@ -1942,15 +1716,7 @@
           <w:b/>
           <w:bCs/>
         </w:rPr>
-        <w:t xml:space="preserve"> muñeca</w:t>
-      </w:r>
-      <w:proofErr w:type="gramEnd"/>
-      <w:r>
-        <w:rPr>
-          <w:b/>
-          <w:bCs/>
-        </w:rPr>
-        <w:t>. ¿Qué partes del modelo podrían aprovecharse y cuáles habría que modificar?</w:t>
+        <w:t xml:space="preserve"> muñeca. ¿Qué partes del modelo podrían aprovecharse y cuáles habría que modificar?</w:t>
       </w:r>
     </w:p>
     <w:p>
@@ -1998,17 +1764,8 @@
           <w:b/>
           <w:bCs/>
         </w:rPr>
-        <w:t xml:space="preserve"> al nuevo dominio. Ser específico: ¿Qué congela, </w:t>
-      </w:r>
-      <w:proofErr w:type="gramStart"/>
-      <w:r>
-        <w:rPr>
-          <w:b/>
-          <w:bCs/>
-        </w:rPr>
-        <w:t>qué descongela, qué modifica en el cabezal, qué tasa de aprendizaje usaría y por qué?</w:t>
-      </w:r>
-      <w:proofErr w:type="gramEnd"/>
+        <w:t xml:space="preserve"> al nuevo dominio. Ser específico: ¿Qué congela, qué descongela, qué modifica en el cabezal, qué tasa de aprendizaje usaría y por qué?</w:t>
+      </w:r>
     </w:p>
     <w:p>
       <w:pPr>
@@ -2170,8 +1927,124 @@
         <w:t xml:space="preserve">). Además, recomendaría evaluación humana de expertos antes de desplegar el sistema y también probarlo en distintos hospitales y con distintos equipos para asegurar la generalización. </w:t>
       </w:r>
     </w:p>
+    <w:p>
+      <w:pPr>
+        <w:pStyle w:val="Prrafodelista"/>
+        <w:jc w:val="both"/>
+        <w:rPr>
+          <w:b/>
+          <w:bCs/>
+        </w:rPr>
+      </w:pPr>
+      <w:proofErr w:type="spellStart"/>
+      <w:r>
+        <w:rPr>
+          <w:b/>
+          <w:bCs/>
+        </w:rPr>
+        <w:lastRenderedPageBreak/>
+        <w:t>Task</w:t>
+      </w:r>
+      <w:proofErr w:type="spellEnd"/>
+      <w:r>
+        <w:rPr>
+          <w:b/>
+          <w:bCs/>
+        </w:rPr>
+        <w:t xml:space="preserve"> 4</w:t>
+      </w:r>
+    </w:p>
+    <w:p>
+      <w:pPr>
+        <w:pStyle w:val="Prrafodelista"/>
+        <w:jc w:val="both"/>
+      </w:pPr>
+      <w:r>
+        <w:t xml:space="preserve">Comentario en post de </w:t>
+      </w:r>
+      <w:proofErr w:type="spellStart"/>
+      <w:r>
+        <w:t>linkedin</w:t>
+      </w:r>
+      <w:proofErr w:type="spellEnd"/>
+    </w:p>
+    <w:p>
+      <w:pPr>
+        <w:pStyle w:val="Prrafodelista"/>
+        <w:jc w:val="both"/>
+      </w:pPr>
+      <w:r>
+        <w:drawing>
+          <wp:inline distT="0" distB="0" distL="0" distR="0" wp14:anchorId="526BAD6B" wp14:editId="125BB855">
+            <wp:extent cx="5612130" cy="6382385"/>
+            <wp:effectExtent l="0" t="0" r="7620" b="0"/>
+            <wp:docPr id="1481215402" name="Imagen 1"/>
+            <wp:cNvGraphicFramePr>
+              <a:graphicFrameLocks xmlns:a="http://schemas.openxmlformats.org/drawingml/2006/main" noChangeAspect="1"/>
+            </wp:cNvGraphicFramePr>
+            <a:graphic xmlns:a="http://schemas.openxmlformats.org/drawingml/2006/main">
+              <a:graphicData uri="http://schemas.openxmlformats.org/drawingml/2006/picture">
+                <pic:pic xmlns:pic="http://schemas.openxmlformats.org/drawingml/2006/picture">
+                  <pic:nvPicPr>
+                    <pic:cNvPr id="1481215402" name=""/>
+                    <pic:cNvPicPr/>
+                  </pic:nvPicPr>
+                  <pic:blipFill>
+                    <a:blip r:embed="rId8"/>
+                    <a:stretch>
+                      <a:fillRect/>
+                    </a:stretch>
+                  </pic:blipFill>
+                  <pic:spPr>
+                    <a:xfrm>
+                      <a:off x="0" y="0"/>
+                      <a:ext cx="5612130" cy="6382385"/>
+                    </a:xfrm>
+                    <a:prstGeom prst="rect">
+                      <a:avLst/>
+                    </a:prstGeom>
+                  </pic:spPr>
+                </pic:pic>
+              </a:graphicData>
+            </a:graphic>
+          </wp:inline>
+        </w:drawing>
+      </w:r>
+    </w:p>
+    <w:p>
+      <w:pPr>
+        <w:pStyle w:val="Prrafodelista"/>
+        <w:jc w:val="both"/>
+      </w:pPr>
+    </w:p>
+    <w:p>
+      <w:pPr>
+        <w:pStyle w:val="Prrafodelista"/>
+        <w:jc w:val="both"/>
+      </w:pPr>
+      <w:r>
+        <w:t>Link de comentario:</w:t>
+      </w:r>
+    </w:p>
+    <w:p>
+      <w:pPr>
+        <w:pStyle w:val="Prrafodelista"/>
+        <w:jc w:val="both"/>
+      </w:pPr>
+      <w:hyperlink r:id="rId9" w:history="1">
+        <w:r>
+          <w:rPr>
+            <w:rStyle w:val="Hipervnculo"/>
+          </w:rPr>
+          <w:t>https://www.linkedin.com/feed/update/urn:li:activity:7439702171182551041?commentUrn=urn%3Ali%3Acomment%3A%28activity%3A7439702171182551041%2C7443079280428961792%29&amp;dashCommentUrn=urn%3Ali%3Afsd_comment%3A%287443079280428961792%2Curn%3Ali%3Aactivity%3A7439702171182551041%29</w:t>
+        </w:r>
+      </w:hyperlink>
+      <w:r>
+        <w:t xml:space="preserve"> </w:t>
+      </w:r>
+    </w:p>
     <w:sectPr>
-      <w:headerReference w:type="first" r:id="rId7"/>
+      <w:headerReference w:type="first" r:id="rId10"/>
       <w:pgSz w:w="12240" w:h="15840"/>
       <w:pgMar w:top="1417" w:right="1701" w:bottom="1417" w:left="1701" w:header="708" w:footer="708" w:gutter="0"/>
       <w:cols w:space="708"/>
@@ -3292,6 +3165,7 @@
   <w:style w:type="character" w:default="1" w:styleId="Fuentedeprrafopredeter">
     <w:name w:val="Default Paragraph Font"/>
     <w:uiPriority w:val="1"/>
+    <w:semiHidden/>
     <w:unhideWhenUsed/>
   </w:style>
   <w:style w:type="table" w:default="1" w:styleId="Tablanormal">
@@ -3657,6 +3531,29 @@
     <w:rsid w:val="008C6653"/>
     <w:rPr>
       <w:color w:val="666666"/>
+    </w:rPr>
+  </w:style>
+  <w:style w:type="character" w:styleId="Hipervnculo">
+    <w:name w:val="Hyperlink"/>
+    <w:basedOn w:val="Fuentedeprrafopredeter"/>
+    <w:uiPriority w:val="99"/>
+    <w:unhideWhenUsed/>
+    <w:rsid w:val="002C49F0"/>
+    <w:rPr>
+      <w:color w:val="467886" w:themeColor="hyperlink"/>
+      <w:u w:val="single"/>
+    </w:rPr>
+  </w:style>
+  <w:style w:type="character" w:styleId="Mencinsinresolver">
+    <w:name w:val="Unresolved Mention"/>
+    <w:basedOn w:val="Fuentedeprrafopredeter"/>
+    <w:uiPriority w:val="99"/>
+    <w:semiHidden/>
+    <w:unhideWhenUsed/>
+    <w:rsid w:val="002C49F0"/>
+    <w:rPr>
+      <w:color w:val="605E5C"/>
+      <w:shd w:val="clear" w:color="auto" w:fill="E1DFDD"/>
     </w:rPr>
   </w:style>
 </w:styles>

</xml_diff>